<commit_message>
Bid package / freeze-record commit: bid_technical_baseline_v2 pinned to technical source 5eee4b8; package regenerated from it (A9.25 two-SHA discipline, A9.26 mass presentation)
Technical source 5eee4b8 verified (GitHub CI 37263814635 green; local full suite, Rule-9, ci_checks 11/11, golden).
Package: all evidence read with git show 5eee4b8:<path>; mass from mass_power_a9_v5 (38.35 kg dry; 40.35 / 43.35 /
48.35 kg wet, DOES_NOT_CLOSE; MASS INCOMPLETE_EVIDENCE / NOT_YET_CLOSED); 37 clause statuses unchanged; v1 record kept.

Co-Authored-By: Claude Opus 5.5 <noreply@anthropic.com>
Claude-Session: https://claude.ai/code/session_013RZwqnLAgKXHzcbbsGcB4F
</commit_message>
<xml_diff>
--- a/docs/bid/package/docx/01_COMPLIANCE_MATRIX.docx
+++ b/docs/bid/package/docx/01_COMPLIANCE_MATRIX.docx
@@ -42,7 +42,7 @@
         <w:rPr>
           <w:rFonts w:ascii="Consolas" w:hAnsi="Consolas"/>
         </w:rPr>
-        <w:t>b0937e8</w:t>
+        <w:t>5eee4b8</w:t>
       </w:r>
       <w:r>
         <w:t xml:space="preserve"> (</w:t>
@@ -51,7 +51,7 @@
         <w:rPr>
           <w:rFonts w:ascii="Consolas" w:hAnsi="Consolas"/>
         </w:rPr>
-        <w:t>b0937e88b4ad21cb31c5778aac4b3dca88fdd94a</w:t>
+        <w:t>5eee4b8c82a9403b6bb82d5f8d324526f5d6399b</w:t>
       </w:r>
       <w:r>
         <w:t xml:space="preserve">, pinned by </w:t>
@@ -92,7 +92,7 @@
         <w:rPr>
           <w:rFonts w:ascii="Consolas" w:hAnsi="Consolas"/>
         </w:rPr>
-        <w:t>b0937e8</w:t>
+        <w:t>5eee4b8</w:t>
       </w:r>
       <w:r>
         <w:t xml:space="preserve">; read it with </w:t>
@@ -101,7 +101,7 @@
         <w:rPr>
           <w:rFonts w:ascii="Consolas" w:hAnsi="Consolas"/>
         </w:rPr>
-        <w:t>git show b0937e8:&lt;path&gt;</w:t>
+        <w:t>git show 5eee4b8:&lt;path&gt;</w:t>
       </w:r>
       <w:r>
         <w:t xml:space="preserve">. Locators are JSON pointers (with </w:t>
@@ -124,7 +124,7 @@
         <w:rPr>
           <w:rFonts w:ascii="Consolas" w:hAnsi="Consolas"/>
         </w:rPr>
-        <w:t>b0937e8</w:t>
+        <w:t>5eee4b8</w:t>
       </w:r>
       <w:r>
         <w:t xml:space="preserve"> no RVM row of the flight configuration is PASS (27 NOT_EVALUATED, 3 INCOMPLETE_EVIDENCE), the Hall credible transport set is empty and every absolute 0-D Hall result is withdrawn; this matrix quotes none of them.</w:t>
@@ -193,7 +193,7 @@
           </w:tcPr>
           <w:p>
             <w:r>
-              <w:t>the offered design, as recorded at the technical source b0937e8, already meets the clause as written (a property of the offer; no test result is implied)</w:t>
+              <w:t>the offered design, as recorded at the technical source 5eee4b8, already meets the clause as written (a property of the offer; no test result is implied)</w:t>
             </w:r>
           </w:p>
         </w:tc>
@@ -215,7 +215,7 @@
           </w:tcPr>
           <w:p>
             <w:r>
-              <w:t>Vyovrinda proposes to comply; the repository at b0937e8 holds the plan / verification path (file + locator); nothing is yet demonstrated</w:t>
+              <w:t>Vyovrinda proposes to comply; the repository at 5eee4b8 holds the plan / verification path (file + locator); nothing is yet demonstrated</w:t>
             </w:r>
           </w:p>
         </w:tc>
@@ -237,7 +237,7 @@
           </w:tcPr>
           <w:p>
             <w:r>
-              <w:t>some sub-items have a plan or evidence path at b0937e8, others have none yet (listed in the response)</w:t>
+              <w:t>some sub-items have a plan or evidence path at 5eee4b8, others have none yet (listed in the response)</w:t>
             </w:r>
           </w:p>
         </w:tc>
@@ -259,7 +259,7 @@
           </w:tcPr>
           <w:p>
             <w:r>
-              <w:t>a technical performance requirement whose outcome depends on hardware / validation evidence that does not exist at b0937e8; the programme has a path, but the package must not claim the outcome</w:t>
+              <w:t>a technical performance requirement whose outcome depends on hardware / validation evidence that does not exist at 5eee4b8; the programme has a path, but the package must not claim the outcome</w:t>
             </w:r>
           </w:p>
         </w:tc>
@@ -2511,7 +2511,7 @@
         <w:t>Response.</w:t>
       </w:r>
       <w:r>
-        <w:t xml:space="preserve"> Vyovrinda proposes to develop, test and space-qualify an ABEP system for VLEO. The programme is hardware-first (owner pivot 2026-09-27, A9.21 hardware order); the development and test plan (03_DEVELOPMENT_AND_TEST_PLAN.md) maps it onto Milestones 1-5. No part of the system is yet demonstrated: at b0937e8 all 30 RVM rows of the flight configuration are NOT_EVALUATED (27) or INCOMPLETE_EVIDENCE (3); none is PASS.</w:t>
+        <w:t xml:space="preserve"> Vyovrinda proposes to develop, test and space-qualify an ABEP system for VLEO. The programme is hardware-first (owner pivot 2026-09-27, A9.21 hardware order); the development and test plan (03_DEVELOPMENT_AND_TEST_PLAN.md) maps it onto Milestones 1-5. No part of the system is yet demonstrated: at 5eee4b8 all 30 RVM rows of the flight configuration are NOT_EVALUATED (27) or INCOMPLETE_EVIDENCE (3); none is PASS.</w:t>
       </w:r>
     </w:p>
     <w:p>
@@ -2519,7 +2519,7 @@
         <w:rPr>
           <w:b/>
         </w:rPr>
-        <w:t>Evidence at b0937e8:</w:t>
+        <w:t>Evidence at 5eee4b8:</w:t>
       </w:r>
     </w:p>
     <w:p>
@@ -2610,7 +2610,7 @@
         <w:rPr>
           <w:b/>
         </w:rPr>
-        <w:t>Evidence at b0937e8:</w:t>
+        <w:t>Evidence at 5eee4b8:</w:t>
       </w:r>
     </w:p>
     <w:p>
@@ -2719,7 +2719,7 @@
         <w:rPr>
           <w:rFonts w:ascii="Consolas" w:hAnsi="Consolas"/>
         </w:rPr>
-        <w:t>docs/budgets/mass_power_a9_v4/mass_power_a9_v4.json</w:t>
+        <w:t>docs/budgets/mass_power_a9_v5/mass_power_a9_v5.json</w:t>
       </w:r>
       <w:r>
         <w:t xml:space="preserve"> #/lines/hall_icp_neutralizer</w:t>
@@ -2763,7 +2763,7 @@
         <w:t>Response.</w:t>
       </w:r>
       <w:r>
-        <w:t xml:space="preserve"> The EM -&gt; EM integration -&gt; EM integration test -&gt; QM (intake/compressor, power electronics, thruster) -&gt; QM integration test flow is adopted as the project's model philosophy and mapped onto the milestones in 03_DEVELOPMENT_AND_TEST_PLAN.md section 4. No EM or QM hardware exists at b0937e8 (RVM-25: no verification artifact exists; T0 not set).</w:t>
+        <w:t xml:space="preserve"> The EM -&gt; EM integration -&gt; EM integration test -&gt; QM (intake/compressor, power electronics, thruster) -&gt; QM integration test flow is adopted as the project's model philosophy and mapped onto the milestones in 03_DEVELOPMENT_AND_TEST_PLAN.md section 4. No EM or QM hardware exists at 5eee4b8 (RVM-25: no verification artifact exists; T0 not set).</w:t>
       </w:r>
     </w:p>
     <w:p>
@@ -2771,7 +2771,7 @@
         <w:rPr>
           <w:b/>
         </w:rPr>
-        <w:t>Evidence at b0937e8:</w:t>
+        <w:t>Evidence at 5eee4b8:</w:t>
       </w:r>
     </w:p>
     <w:p>
@@ -2826,7 +2826,7 @@
         <w:t>Response.</w:t>
       </w:r>
       <w:r>
-        <w:t xml:space="preserve"> Each listed critical technology is addressed, none is yet demonstrated: (1) thruster ionizing N2 and nascent O: Hall transport validation gate 3 is FAIL at b0937e8 (credible transport set empty; P5-N2 v1 INCONCLUSIVE, permanent), the N2/N reaction set is complete only for its pre-registered domain, and the O/O2 chemistry v0 tables are DRAFT and unused; (2) AO material compatibility: AO / lifetime register v5 and the P4 anode-materials framework exist, every P4 gate is INCOMPLETE_EVIDENCE, anode material OPEN; RVM-16 is read for the current architecture (OWNER_CONFIRMED_CURRENT_ARCHITECTURE_READING: no flight keeper; AO / O compatibility applies to the actual AO / O-exposed components - anode, RF-ICP electron-source / neutralizer plasma-facing surfaces, collector / bias electrode, gas path; no graphite as the current flight baseline for O / AO-exposed plasma-facing or electron-source surfaces until coupon evidence supports it); (3) intake and compressor: F1-F4 parametric screening over the frozen 196-state design-state set, robust upstream set EMPTY (F9-DF-01); (4) test facility simulating the VLEO air mixture: no facility record exists in the repository (OWNER_INPUT_REQUIRED, see 05_PROGRAMMATIC_SECTIONS.md).</w:t>
+        <w:t xml:space="preserve"> Each listed critical technology is addressed, none is yet demonstrated: (1) thruster ionizing N2 and nascent O: Hall transport validation gate 3 is FAIL at 5eee4b8 (credible transport set empty; P5-N2 v1 INCONCLUSIVE, permanent), the N2/N reaction set is complete only for its pre-registered domain, and the O/O2 chemistry v0 tables are DRAFT and unused; (2) AO material compatibility: AO / lifetime register v5 and the P4 anode-materials framework exist, every P4 gate is INCOMPLETE_EVIDENCE, anode material OPEN; RVM-16 is read for the current architecture (OWNER_CONFIRMED_CURRENT_ARCHITECTURE_READING: no flight keeper; AO / O compatibility applies to the actual AO / O-exposed components - anode, RF-ICP electron-source / neutralizer plasma-facing surfaces, collector / bias electrode, gas path; no graphite as the current flight baseline for O / AO-exposed plasma-facing or electron-source surfaces until coupon evidence supports it); (3) intake and compressor: F1-F4 parametric screening over the frozen 196-state design-state set, robust upstream set EMPTY (F9-DF-01); (4) test facility simulating the VLEO air mixture: no facility record exists in the repository (OWNER_INPUT_REQUIRED, see 05_PROGRAMMATIC_SECTIONS.md).</w:t>
       </w:r>
     </w:p>
     <w:p>
@@ -2834,7 +2834,7 @@
         <w:rPr>
           <w:b/>
         </w:rPr>
-        <w:t>Evidence at b0937e8:</w:t>
+        <w:t>Evidence at 5eee4b8:</w:t>
       </w:r>
     </w:p>
     <w:p>
@@ -3012,7 +3012,7 @@
         <w:t>Response.</w:t>
       </w:r>
       <w:r>
-        <w:t xml:space="preserve"> Intake design is the subject of design-synthesis lane F1 (TPMC reduced-order intake model, Maxwell + CLL wall models, frozen NRLMSIS 2.1 atmosphere, frozen 196-state design-state set atmosphere_msis21_orbit_v1_design_states_v2, BROAD_ENVELOPE_ALL_INCLINATIONS_ALL_LTAN_NOT_MISSION_ICD). At b0937e8 the coupled upstream screen is model-derived under PARAMETRIC_SENSITIVITY inputs: the nominal all-state delivered-flow frontier is 0.01296 mg/s, 0 Pareto members reach the lower end (0.38 mg/s) of the ground characterization coverage at every state (F78-02; coverage, not a requirement), and the F8 robust upstream set is EMPTY (0 members; F9-DF-01 EMPTY_ROBUST_SET_NOT_EVALUATED). This is a design finding for the owner, not a demonstrated requirement failure and not a requirement relaxation; no robust upstream (intake / compressor / feed) closure is claimed.</w:t>
+        <w:t xml:space="preserve"> Intake design is the subject of design-synthesis lane F1 (TPMC reduced-order intake model, Maxwell + CLL wall models, frozen NRLMSIS 2.1 atmosphere, frozen 196-state design-state set atmosphere_msis21_orbit_v1_design_states_v2, BROAD_ENVELOPE_ALL_INCLINATIONS_ALL_LTAN_NOT_MISSION_ICD). At 5eee4b8 the coupled upstream screen is model-derived under PARAMETRIC_SENSITIVITY inputs: the nominal all-state delivered-flow frontier is 0.01296 mg/s, 0 Pareto members reach the lower end (0.38 mg/s) of the ground characterization coverage at every state (F78-02; coverage, not a requirement), and the F8 robust upstream set is EMPTY (0 members; F9-DF-01 EMPTY_ROBUST_SET_NOT_EVALUATED). This is a design finding for the owner, not a demonstrated requirement failure and not a requirement relaxation; no robust upstream (intake / compressor / feed) closure is claimed.</w:t>
       </w:r>
     </w:p>
     <w:p>
@@ -3020,7 +3020,7 @@
         <w:rPr>
           <w:b/>
         </w:rPr>
-        <w:t>Evidence at b0937e8:</w:t>
+        <w:t>Evidence at 5eee4b8:</w:t>
       </w:r>
     </w:p>
     <w:p>
@@ -3167,7 +3167,7 @@
         <w:rPr>
           <w:b/>
         </w:rPr>
-        <w:t>Evidence at b0937e8:</w:t>
+        <w:t>Evidence at 5eee4b8:</w:t>
       </w:r>
     </w:p>
     <w:p>
@@ -3220,7 +3220,7 @@
         <w:rPr>
           <w:rFonts w:ascii="Consolas" w:hAnsi="Consolas"/>
         </w:rPr>
-        <w:t>docs/budgets/mass_power_a9_v4/mass_power_a9_v4.json</w:t>
+        <w:t>docs/budgets/mass_power_a9_v5/mass_power_a9_v5.json</w:t>
       </w:r>
       <w:r>
         <w:t xml:space="preserve"> #/lines/hall_icp_neutralizer[line=AL-02]</w:t>
@@ -3258,7 +3258,7 @@
         <w:rPr>
           <w:b/>
         </w:rPr>
-        <w:t>Evidence at b0937e8:</w:t>
+        <w:t>Evidence at 5eee4b8:</w:t>
       </w:r>
     </w:p>
     <w:p>
@@ -3405,7 +3405,7 @@
         <w:rPr>
           <w:b/>
         </w:rPr>
-        <w:t>Evidence at b0937e8:</w:t>
+        <w:t>Evidence at 5eee4b8:</w:t>
       </w:r>
     </w:p>
     <w:p>
@@ -3521,7 +3521,7 @@
         <w:rPr>
           <w:b/>
         </w:rPr>
-        <w:t>Evidence at b0937e8:</w:t>
+        <w:t>Evidence at 5eee4b8:</w:t>
       </w:r>
     </w:p>
     <w:p>
@@ -3546,7 +3546,7 @@
         <w:rPr>
           <w:rFonts w:ascii="Consolas" w:hAnsi="Consolas"/>
         </w:rPr>
-        <w:t>docs/budgets/mass_power_a9_v4/mass_power_a9_v4.json</w:t>
+        <w:t>docs/budgets/mass_power_a9_v5/mass_power_a9_v5.json</w:t>
       </w:r>
       <w:r>
         <w:t xml:space="preserve"> #/rollups[configuration=hall_icp_neutralizer]</w:t>
@@ -3595,7 +3595,7 @@
         <w:rPr>
           <w:b/>
         </w:rPr>
-        <w:t>Evidence at b0937e8:</w:t>
+        <w:t>Evidence at 5eee4b8:</w:t>
       </w:r>
     </w:p>
     <w:p>
@@ -3697,7 +3697,7 @@
         <w:rPr>
           <w:b/>
         </w:rPr>
-        <w:t>Evidence at b0937e8:</w:t>
+        <w:t>Evidence at 5eee4b8:</w:t>
       </w:r>
     </w:p>
     <w:p>
@@ -3827,7 +3827,7 @@
         <w:rPr>
           <w:b/>
         </w:rPr>
-        <w:t>Evidence at b0937e8:</w:t>
+        <w:t>Evidence at 5eee4b8:</w:t>
       </w:r>
     </w:p>
     <w:p>
@@ -3946,7 +3946,7 @@
         <w:rPr>
           <w:b/>
         </w:rPr>
-        <w:t>Evidence at b0937e8:</w:t>
+        <w:t>Evidence at 5eee4b8:</w:t>
       </w:r>
     </w:p>
     <w:p>
@@ -4065,7 +4065,7 @@
         <w:rPr>
           <w:b/>
         </w:rPr>
-        <w:t>Evidence at b0937e8:</w:t>
+        <w:t>Evidence at 5eee4b8:</w:t>
       </w:r>
     </w:p>
     <w:p>
@@ -4156,7 +4156,7 @@
         <w:rPr>
           <w:b/>
         </w:rPr>
-        <w:t>Evidence at b0937e8:</w:t>
+        <w:t>Evidence at 5eee4b8:</w:t>
       </w:r>
     </w:p>
     <w:p>
@@ -4195,7 +4195,7 @@
         <w:rPr>
           <w:rFonts w:ascii="Consolas" w:hAnsi="Consolas"/>
         </w:rPr>
-        <w:t>docs/budgets/mass_power_a9_v4/mass_power_a9_v4.json</w:t>
+        <w:t>docs/budgets/mass_power_a9_v5/mass_power_a9_v5.json</w:t>
       </w:r>
       <w:r>
         <w:t xml:space="preserve"> #/lines/hall_icp_neutralizer[line=AL-08]</w:t>
@@ -4295,7 +4295,7 @@
         <w:t>Response.</w:t>
       </w:r>
       <w:r>
-        <w:t xml:space="preserve"> Accepted as a design requirement (single-point-failure tolerance for electronics). No electronics design or FMEA exists at b0937e8 (RVM-19 NOT_EVALUATED). The owner must decide the redundancy concept before PDR-1; see RFP-P18-02.</w:t>
+        <w:t xml:space="preserve"> Accepted as a design requirement (single-point-failure tolerance for electronics). No electronics design or FMEA exists at 5eee4b8 (RVM-19 NOT_EVALUATED). The owner must decide the redundancy concept before PDR-1; see RFP-P18-02.</w:t>
       </w:r>
     </w:p>
     <w:p>
@@ -4303,7 +4303,7 @@
         <w:rPr>
           <w:b/>
         </w:rPr>
-        <w:t>Evidence at b0937e8:</w:t>
+        <w:t>Evidence at 5eee4b8:</w:t>
       </w:r>
     </w:p>
     <w:p>
@@ -4363,7 +4363,7 @@
         <w:rPr>
           <w:b/>
         </w:rPr>
-        <w:t>Evidence at b0937e8:</w:t>
+        <w:t>Evidence at 5eee4b8:</w:t>
       </w:r>
     </w:p>
     <w:p>
@@ -4446,7 +4446,7 @@
         <w:t>Response.</w:t>
       </w:r>
       <w:r>
-        <w:t xml:space="preserve"> Requirement: complete flight wet mass &lt; 40 kg (the owner's conservative wet reading of the RFP '&lt; 40kg'; DISC-02 recorded for DRDO clarification); not relaxed. Proposal design target (owner decision A9.26): nominal dry &lt;= 34.0 kg with a 10 % system margin and the 2 kg Xe planning reference -&gt; 39.4 kg wet - a DESIGN TARGET, not evidence; the 2 kg Xe case is a planning reference, not the selected Xe load. Current provisional planning / evidence roll-up (mass_power_a9_v4 at b0937e8; owner allocations and MEV planning floors, no CBE, no measured mass): dry 40.57 kg after a 20 % system margin; wet 42.57 / 45.57 / 50.57 kg at the 2 / 5 / 10 kg Xe planning / sensitivity cases (DOES_NOT_CLOSE in all 3 cases against &lt; 40 kg); AL-09 has no value in this record and is excluded from the known part. Current status: MASS INCOMPLETE_EVIDENCE / NOT_YET_CLOSED (AG-11 INCOMPLETE_EVIDENCE (no CBE; AL-04 / AL-07 / AL-08 below evidence floors)); no mass compliance is claimed. Mass-closure actions: AL-07 current cathodeless PPU CBE / requote; AL-08 quote / design rebase; AL-04 completed Hall-head CBE; AL-09 design-derived CBE; actual routed harness; subsystem integration / structural optimization. Disclosed open item (risk R-07).</w:t>
+        <w:t xml:space="preserve"> Requirement: complete flight wet mass &lt; 40 kg (the owner's conservative wet reading of the RFP '&lt; 40kg'; DISC-02 recorded for DRDO clarification); not relaxed. Proposal design target (owner decision A9.26): nominal dry &lt;= 34.0 kg with a 10 % system margin and the 2 kg Xe planning reference -&gt; 39.4 kg wet - a DESIGN TARGET, not evidence; the 2 kg Xe case is a planning reference, not the selected Xe load. Current provisional planning / evidence roll-up (mass_power_a9_v5 at 5eee4b8; owner allocations and MEV planning floors, no CBE, no measured mass): dry 38.35 kg after a 10 % system margin; wet 40.35 / 43.35 / 48.35 kg at the 2 / 5 / 10 kg Xe planning / sensitivity cases (DOES_NOT_CLOSE in all 3 cases against &lt; 40 kg). Current status: MASS INCOMPLETE_EVIDENCE / NOT_YET_CLOSED (AG-11 INCOMPLETE_EVIDENCE (no CBE; AL-04 / AL-07 / AL-08 below evidence floors)); no mass compliance is claimed. Mass-closure actions: AL-07 current cathodeless PPU CBE / requote; AL-08 quote / design rebase; AL-04 completed Hall-head CBE; AL-09 design-derived CBE; actual routed harness; subsystem integration / structural optimization. Disclosed open item (risk R-07).</w:t>
       </w:r>
     </w:p>
     <w:p>
@@ -4454,7 +4454,7 @@
         <w:rPr>
           <w:b/>
         </w:rPr>
-        <w:t>Evidence at b0937e8:</w:t>
+        <w:t>Evidence at 5eee4b8:</w:t>
       </w:r>
     </w:p>
     <w:p>
@@ -4465,7 +4465,7 @@
         <w:rPr>
           <w:rFonts w:ascii="Consolas" w:hAnsi="Consolas"/>
         </w:rPr>
-        <w:t>docs/budgets/mass_power_a9_v4/mass_power_a9_v4.json</w:t>
+        <w:t>docs/budgets/mass_power_a9_v5/mass_power_a9_v5.json</w:t>
       </w:r>
       <w:r>
         <w:t xml:space="preserve"> #/rollups[configuration=hall_icp_neutralizer]</w:t>
@@ -4479,7 +4479,7 @@
         <w:rPr>
           <w:rFonts w:ascii="Consolas" w:hAnsi="Consolas"/>
         </w:rPr>
-        <w:t>docs/budgets/mass_power_a9_v4/mass_power_a9_v4.json</w:t>
+        <w:t>docs/budgets/mass_power_a9_v5/mass_power_a9_v5.json</w:t>
       </w:r>
       <w:r>
         <w:t xml:space="preserve"> #/lines/hall_icp_neutralizer</w:t>
@@ -4493,7 +4493,7 @@
         <w:rPr>
           <w:rFonts w:ascii="Consolas" w:hAnsi="Consolas"/>
         </w:rPr>
-        <w:t>docs/budgets/mass_power_a9_v4/mass_power_a9_v4.json</w:t>
+        <w:t>docs/budgets/mass_power_a9_v5/mass_power_a9_v5.json</w:t>
       </w:r>
       <w:r>
         <w:t xml:space="preserve"> #/margin_convention</w:t>
@@ -4557,6 +4557,20 @@
     </w:p>
     <w:p>
       <w:pPr>
+        <w:pStyle w:val="ListBullet"/>
+      </w:pPr>
+      <w:r>
+        <w:rPr>
+          <w:rFonts w:ascii="Consolas" w:hAnsi="Consolas"/>
+        </w:rPr>
+        <w:t>docs/decisions/OD_2026_10_05_A9_26_mass_budget_owner_decisions.json</w:t>
+      </w:r>
+      <w:r>
+        <w:t xml:space="preserve"> #/owner_decision_summary</w:t>
+      </w:r>
+    </w:p>
+    <w:p>
+      <w:pPr>
         <w:pStyle w:val="Heading3"/>
       </w:pPr>
       <w:r>
@@ -4587,7 +4601,7 @@
         <w:rPr>
           <w:b/>
         </w:rPr>
-        <w:t>Evidence at b0937e8:</w:t>
+        <w:t>Evidence at 5eee4b8:</w:t>
       </w:r>
     </w:p>
     <w:p>
@@ -4661,7 +4675,7 @@
         <w:rPr>
           <w:b/>
         </w:rPr>
-        <w:t>Evidence at b0937e8:</w:t>
+        <w:t>Evidence at 5eee4b8:</w:t>
       </w:r>
     </w:p>
     <w:p>
@@ -4766,7 +4780,7 @@
         <w:rPr>
           <w:b/>
         </w:rPr>
-        <w:t>Evidence at b0937e8:</w:t>
+        <w:t>Evidence at 5eee4b8:</w:t>
       </w:r>
     </w:p>
     <w:p>
@@ -4857,7 +4871,7 @@
         <w:rPr>
           <w:b/>
         </w:rPr>
-        <w:t>Evidence at b0937e8:</w:t>
+        <w:t>Evidence at 5eee4b8:</w:t>
       </w:r>
     </w:p>
     <w:p>
@@ -4868,7 +4882,7 @@
         <w:rPr>
           <w:rFonts w:ascii="Consolas" w:hAnsi="Consolas"/>
         </w:rPr>
-        <w:t>docs/budgets/mass_power_a9_v4/mass_power_a9_v4.json</w:t>
+        <w:t>docs/budgets/mass_power_a9_v5/mass_power_a9_v5.json</w:t>
       </w:r>
       <w:r>
         <w:t xml:space="preserve"> #/lines/hall_icp_neutralizer</w:t>
@@ -4940,7 +4954,7 @@
         <w:t>Response.</w:t>
       </w:r>
       <w:r>
-        <w:t xml:space="preserve"> QM ENTEST qualification (launch vibration / shock for PSLV / SSLV or the DRDO-decided LV, AO erosion, radiation, thermal, ThermoVac, 3-year VLEO life) is planned at Milestone 5 against the ENTEST specification issued at PDR. No numeric levels are assumed (DISC-09). Thermal closure is UNRESOLVED at b0937e8 (coupled H-1 / ICP and anode); the inherited P3 cathode thermal node is NOT_USABLE_FOR_FLIGHT_THERMAL_CLOSURE for the cathodeless architecture (AFI-03; successor cathodeless thermal model is post-bid work); AO erosion via the AO programme.</w:t>
+        <w:t xml:space="preserve"> QM ENTEST qualification (launch vibration / shock for PSLV / SSLV or the DRDO-decided LV, AO erosion, radiation, thermal, ThermoVac, 3-year VLEO life) is planned at Milestone 5 against the ENTEST specification issued at PDR. No numeric levels are assumed (DISC-09). Thermal closure is UNRESOLVED at 5eee4b8 (coupled H-1 / ICP and anode); the inherited P3 cathode thermal node is NOT_USABLE_FOR_FLIGHT_THERMAL_CLOSURE for the cathodeless architecture (AFI-03; successor cathodeless thermal model is post-bid work); AO erosion via the AO programme.</w:t>
       </w:r>
     </w:p>
     <w:p>
@@ -4948,7 +4962,7 @@
         <w:rPr>
           <w:b/>
         </w:rPr>
-        <w:t>Evidence at b0937e8:</w:t>
+        <w:t>Evidence at 5eee4b8:</w:t>
       </w:r>
     </w:p>
     <w:p>
@@ -5045,7 +5059,7 @@
         <w:t>Response.</w:t>
       </w:r>
       <w:r>
-        <w:t xml:space="preserve"> A detailed IC plan for &gt;= 75 % project IC (thruster &gt; 80 %, intake &gt; 80 %, compressor and storage &gt; 60 %, PSE &gt; 70 %) is required. No part is selected and no supplier origin is recorded at b0937e8 (RVM-18 NOT_EVALUATED); the plan skeleton with the owner inputs is in 05_PROGRAMMATIC_SECTIONS.md section 1. No IC percentage is stated by this package.</w:t>
+        <w:t xml:space="preserve"> A detailed IC plan for &gt;= 75 % project IC (thruster &gt; 80 %, intake &gt; 80 %, compressor and storage &gt; 60 %, PSE &gt; 70 %) is required. No part is selected and no supplier origin is recorded at 5eee4b8 (RVM-18 NOT_EVALUATED); the plan skeleton with the owner inputs is in 05_PROGRAMMATIC_SECTIONS.md section 1. No IC percentage is stated by this package.</w:t>
       </w:r>
     </w:p>
     <w:p>
@@ -5053,7 +5067,7 @@
         <w:rPr>
           <w:b/>
         </w:rPr>
-        <w:t>Evidence at b0937e8:</w:t>
+        <w:t>Evidence at 5eee4b8:</w:t>
       </w:r>
     </w:p>
     <w:p>
@@ -5127,7 +5141,7 @@
         <w:rPr>
           <w:b/>
         </w:rPr>
-        <w:t>Evidence at b0937e8:</w:t>
+        <w:t>Evidence at 5eee4b8:</w:t>
       </w:r>
     </w:p>
     <w:p>
@@ -5229,7 +5243,7 @@
         <w:rPr>
           <w:b/>
         </w:rPr>
-        <w:t>Evidence at b0937e8:</w:t>
+        <w:t>Evidence at 5eee4b8:</w:t>
       </w:r>
     </w:p>
     <w:p>
@@ -5289,7 +5303,7 @@
         <w:rPr>
           <w:b/>
         </w:rPr>
-        <w:t>Evidence at b0937e8:</w:t>
+        <w:t>Evidence at 5eee4b8:</w:t>
       </w:r>
     </w:p>
     <w:p>
@@ -5352,7 +5366,7 @@
         <w:rPr>
           <w:b/>
         </w:rPr>
-        <w:t>Evidence at b0937e8:</w:t>
+        <w:t>Evidence at 5eee4b8:</w:t>
       </w:r>
     </w:p>
     <w:p>
@@ -5421,7 +5435,7 @@
         <w:t>Response.</w:t>
       </w:r>
       <w:r>
-        <w:t xml:space="preserve"> Milestone 1 (PDR-1, T0+09 months, 15 %): preliminary mechanical and electrical design, BoM, preliminary test plan and test-facility document. Inputs available at b0937e8: H-1 freeze-candidate definition, H2 hardware lanes, RFQ v3 quotation packages (with the RFQ3-GAS rev1 successor), instrumentation definition, P1-P4 frameworks, the mass record mass_power_a9_v4 (provisional planning / evidence floor). Mapping in 03_DEVELOPMENT_AND_TEST_PLAN.md.</w:t>
+        <w:t xml:space="preserve"> Milestone 1 (PDR-1, T0+09 months, 15 %): preliminary mechanical and electrical design, BoM, preliminary test plan and test-facility document. Inputs available at 5eee4b8: H-1 freeze-candidate definition, H2 hardware lanes, RFQ v3 quotation packages (with the RFQ3-GAS rev1 successor), instrumentation definition, P1-P4 frameworks, the mass record mass_power_a9_v5 (provisional planning / evidence floor). Mapping in 03_DEVELOPMENT_AND_TEST_PLAN.md.</w:t>
       </w:r>
     </w:p>
     <w:p>
@@ -5429,7 +5443,7 @@
         <w:rPr>
           <w:b/>
         </w:rPr>
-        <w:t>Evidence at b0937e8:</w:t>
+        <w:t>Evidence at 5eee4b8:</w:t>
       </w:r>
     </w:p>
     <w:p>
@@ -5510,7 +5524,7 @@
         <w:rPr>
           <w:rFonts w:ascii="Consolas" w:hAnsi="Consolas"/>
         </w:rPr>
-        <w:t>docs/budgets/mass_power_a9_v4/mass_power_a9_v4.json</w:t>
+        <w:t>docs/budgets/mass_power_a9_v5/mass_power_a9_v5.json</w:t>
       </w:r>
       <w:r>
         <w:t xml:space="preserve"> #/rollups[configuration=hall_icp_neutralizer]</w:t>
@@ -5540,7 +5554,7 @@
         <w:t>Response.</w:t>
       </w:r>
       <w:r>
-        <w:t xml:space="preserve"> Milestone 2 (PDR-2, T0+12 months, 10 %): PSE software preliminary design, FDIR, telemetry (MATLAB and C), test-facility readiness review. No flight software, FDIR or telemetry artifact exists at b0937e8; the bus-boundary start-up sequencing (SEQ-1) is the only sequencing input. The RFP lists the deliverable as 'approved GNC design document and codes' (verbatim; owner to confirm the reading for a propulsion PSE).</w:t>
+        <w:t xml:space="preserve"> Milestone 2 (PDR-2, T0+12 months, 10 %): PSE software preliminary design, FDIR, telemetry (MATLAB and C), test-facility readiness review. No flight software, FDIR or telemetry artifact exists at 5eee4b8; the bus-boundary start-up sequencing (SEQ-1) is the only sequencing input. The RFP lists the deliverable as 'approved GNC design document and codes' (verbatim; owner to confirm the reading for a propulsion PSE).</w:t>
       </w:r>
     </w:p>
     <w:p>
@@ -5548,7 +5562,7 @@
         <w:rPr>
           <w:b/>
         </w:rPr>
-        <w:t>Evidence at b0937e8:</w:t>
+        <w:t>Evidence at 5eee4b8:</w:t>
       </w:r>
     </w:p>
     <w:p>
@@ -5622,7 +5636,7 @@
         <w:rPr>
           <w:b/>
         </w:rPr>
-        <w:t>Evidence at b0937e8:</w:t>
+        <w:t>Evidence at 5eee4b8:</w:t>
       </w:r>
     </w:p>
     <w:p>
@@ -5685,7 +5699,7 @@
         <w:rPr>
           <w:b/>
         </w:rPr>
-        <w:t>Evidence at b0937e8:</w:t>
+        <w:t>Evidence at 5eee4b8:</w:t>
       </w:r>
     </w:p>
     <w:p>
@@ -5748,7 +5762,7 @@
         <w:rPr>
           <w:b/>
         </w:rPr>
-        <w:t>Evidence at b0937e8:</w:t>
+        <w:t>Evidence at 5eee4b8:</w:t>
       </w:r>
     </w:p>
     <w:p>
@@ -5811,7 +5825,7 @@
         <w:rPr>
           <w:b/>
         </w:rPr>
-        <w:t>Evidence at b0937e8:</w:t>
+        <w:t>Evidence at 5eee4b8:</w:t>
       </w:r>
     </w:p>
     <w:p>
@@ -5885,7 +5899,7 @@
         <w:rPr>
           <w:b/>
         </w:rPr>
-        <w:t>Evidence at b0937e8:</w:t>
+        <w:t>Evidence at 5eee4b8:</w:t>
       </w:r>
     </w:p>
     <w:p>
@@ -5959,7 +5973,7 @@
         <w:rPr>
           <w:b/>
         </w:rPr>
-        <w:t>Evidence at b0937e8:</w:t>
+        <w:t>Evidence at 5eee4b8:</w:t>
       </w:r>
     </w:p>
     <w:p>
@@ -6047,7 +6061,7 @@
         <w:rPr>
           <w:b/>
         </w:rPr>
-        <w:t>Evidence at b0937e8:</w:t>
+        <w:t>Evidence at 5eee4b8:</w:t>
       </w:r>
     </w:p>
     <w:p>
@@ -6114,7 +6128,7 @@
         <w:rPr>
           <w:rFonts w:ascii="Consolas" w:hAnsi="Consolas"/>
         </w:rPr>
-        <w:t>b0937e8</w:t>
+        <w:t>5eee4b8</w:t>
       </w:r>
       <w:r>
         <w:t xml:space="preserve"> (</w:t>
@@ -6186,7 +6200,7 @@
               <w:rPr>
                 <w:b/>
               </w:rPr>
-              <w:t>status at b0937e8</w:t>
+              <w:t>status at 5eee4b8</w:t>
             </w:r>
           </w:p>
         </w:tc>

</xml_diff>

<commit_message>
A9.27 final bid rulings: package commit (RFP-P19-03 COMPLY composition only; RFP-P18-08 split; OIR-DOC-01 review complete / form completion pending; Part IV(A)-(H) submission checklist); technical source 5eee4b8 unchanged
Co-Authored-By: Claude Opus 5.5 <noreply@anthropic.com>
Claude-Session: https://claude.ai/code/session_013RZwqnLAgKXHzcbbsGcB4F
</commit_message>
<xml_diff>
--- a/docs/bid/package/docx/01_COMPLIANCE_MATRIX.docx
+++ b/docs/bid/package/docx/01_COMPLIANCE_MATRIX.docx
@@ -350,7 +350,7 @@
           </w:tcPr>
           <w:p>
             <w:r>
-              <w:t>1</w:t>
+              <w:t>2</w:t>
             </w:r>
           </w:p>
         </w:tc>
@@ -372,7 +372,7 @@
           </w:tcPr>
           <w:p>
             <w:r>
-              <w:t>16</w:t>
+              <w:t>15</w:t>
             </w:r>
           </w:p>
         </w:tc>
@@ -1683,7 +1683,7 @@
           </w:tcPr>
           <w:p>
             <w:r>
-              <w:t>COMPLY_PLANNED_WITH_EVIDENCE_PATH</w:t>
+              <w:t>COMPLY</w:t>
             </w:r>
           </w:p>
         </w:tc>
@@ -4148,7 +4148,7 @@
         <w:t>Response.</w:t>
       </w:r>
       <w:r>
-        <w:t xml:space="preserve"> Two separate supply modes with separate storage are proposed: ambient air (AIR_PRIMARY; intake -&gt; compressor -&gt; gas chamber / plenum) and Xe (XE_CONTINGENCY / emergency; dedicated Xe storage and flow hardware, AL-08: tank, regulator, two series latch isolation valves + one proportional flow-control valve, plumbing, mounting / thermal; owner decision AFI-01-S1). AL-08 = 5.9148 kg is a MEV planning floor, PROVISIONAL_PLANNING_FLOOR_NOT_FROZEN (plumbing and mounting / thermal TBD; quotations rebase it, RFQ3-GAS rev1); no conventional hollow-cathode hardware is in flight AL-08. The flight Xe load is NOT FROZEN (2 / 5 / 10 kg are planning / sensitivity cases). No frozen feed-system design or demonstration exists (RVM-29).</w:t>
+        <w:t xml:space="preserve"> Two separate supply modes with separate storage are proposed: ambient air (AIR_PRIMARY; intake -&gt; compressor -&gt; gas chamber / plenum) and Xe (XE_CONTINGENCY / emergency; dedicated Xe storage and flow hardware, AL-08: tank, regulator, two series latch isolation valves + one proportional flow-control valve, plumbing, mounting / thermal; owner decision AFI-01-S1). AL-08 = 5.9148 kg is a MEV planning floor, PROVISIONAL_PLANNING_FLOOR_NOT_FROZEN (plumbing and mounting / thermal TBD; quotations rebase it, RFQ3-GAS rev1); no conventional hollow-cathode hardware is in flight AL-08. The flight Xe load is NOT FROZEN (2 / 5 / 10 kg are planning / sensitivity cases). No frozen feed-system design or demonstration exists (RVM-29). Owner ruling A9.27 - the clause has two separable aspects: (A) separate propellant tanks / paths: COMPLY BY DESIGN - separate ambient-air and Xe tanks / supply paths are part of the offered architecture; (B) functional ambient-air + Xe capability: PLANNED / NOT YET DEMONSTRATED - the system is designed for both propellants and the determining functional demonstration follows the evidence / test path above. The clause as a whole therefore stays COMPLY_PLANNED_WITH_EVIDENCE_PATH; no functional dual-propellant capability is claimed as demonstrated.</w:t>
       </w:r>
     </w:p>
     <w:p>
@@ -4844,7 +4844,7 @@
         <w:pStyle w:val="Heading3"/>
       </w:pPr>
       <w:r>
-        <w:t>RFP-P19-03 (p. 19, Part III 2 Subsystems) - COMPLY_PLANNED_WITH_EVIDENCE_PATH</w:t>
+        <w:t>RFP-P19-03 (p. 19, Part III 2 Subsystems) - COMPLY</w:t>
       </w:r>
     </w:p>
     <w:p>
@@ -4863,7 +4863,7 @@
         <w:t>Response.</w:t>
       </w:r>
       <w:r>
-        <w:t xml:space="preserve"> Subsystem breakdown adopted: a. Air intake and compressor storage (F1 intake, F2 filter, F3 compressor, F4 gas chamber / plenum, valves; plus the separate Xe storage and valve path); b. Power supply electronics (propulsion PPU incl. RF generator / matching, valve drivers, 1553B / discrete interface); c. Thruster (H-1 Hall accelerator with magnetic circuit and anode / gas distributor, and the downstream RF-ICP neutralizer). Mapping in 02_TECHNICAL_APPROACH.md section 2.2.</w:t>
+        <w:t xml:space="preserve"> Subsystem breakdown adopted: a. Air intake and compressor storage (F1 intake, F2 filter, F3 compressor, F4 gas chamber / plenum, valves; plus the separate Xe storage and valve path); b. Power supply electronics (propulsion PPU incl. RF generator / matching, valve drivers, 1553B / discrete interface); c. Thruster (H-1 Hall accelerator with magnetic circuit and anode / gas distributor, and the downstream RF-ICP neutralizer). Mapping in 02_TECHNICAL_APPROACH.md section 2.2. COMPLY (owner ruling A9.27) confirms the proposed system composition only: it does not claim that the performance, qualification or determining evidence of each subsystem has already been completed; no engineering gate status changes.</w:t>
       </w:r>
     </w:p>
     <w:p>
@@ -6896,7 +6896,7 @@
         <w:pStyle w:val="Heading2"/>
       </w:pPr>
       <w:r>
-        <w:t>RFP pages not screened by the repository</w:t>
+        <w:t>RFP pages not transcribed by the repository</w:t>
       </w:r>
     </w:p>
     <w:p>
@@ -6929,7 +6929,7 @@
     </w:p>
     <w:p>
       <w:r>
-        <w:t>The owner must still check those pages for mandatory formats, annexures, declarations and compliance-statement formats (OIR-DOC-01).</w:t>
+        <w:t>Owner ruling A9.27: the owner has reviewed those pages including the formats; OIR-DOC-01 = REVIEW_COMPLETE_SUBMISSION_FORM_COMPLETION_PENDING (Part IV(A)-(H) forms and submission controls; 06_SUBMISSION_CHECKLIST.md).</w:t>
       </w:r>
     </w:p>
     <w:sectPr>

</xml_diff>